<commit_message>
Questions business model : recentrage sur les 4 gammes (ventes croisées dans le top 3)
Co-Authored-By: Claude Opus 5.5 <noreply@anthropic.com>
Claude-Session: https://claude.ai/code/session_01GhVoXRgaJJbfXgbund27Nd
</commit_message>
<xml_diff>
--- a/livrables/Questions_Business_Model_sip_lab.docx
+++ b/livrables/Questions_Business_Model_sip_lab.docx
@@ -92,7 +92,107 @@
           <w:sz w:val="21"/>
           <w:szCs w:val="21"/>
         </w:rPr>
-        <w:t xml:space="preserve">Chacune des questions a été évaluée selon son importance pour le projet sip lab : une paille active (compléments alimentaires à boire), lancée avec la gamme luna (santé féminine), vendue en ligne sur abonnement et fabriquée en sous-traitance par un partenaire technologique (Unistraw ou un autre fournisseur).</w:t>
+        <w:t xml:space="preserve">Chacune des questions a été évaluée selon son importance pour le projet sip lab : une marque de pailles actives (compléments alimentaires à boire) pensée pour toute la famille, en </w:t>
+      </w:r>
+      <w:r>
+        <w:rPr>
+          <w:rFonts w:ascii="Calibri" w:cs="Calibri" w:eastAsia="Calibri" w:hAnsi="Calibri"/>
+          <w:b/>
+          <w:bCs/>
+          <w:color w:val="2A1A20"/>
+          <w:sz w:val="21"/>
+          <w:szCs w:val="21"/>
+        </w:rPr>
+        <w:t xml:space="preserve">4 gammes</w:t>
+      </w:r>
+      <w:r>
+        <w:rPr>
+          <w:rFonts w:ascii="Calibri" w:cs="Calibri" w:eastAsia="Calibri" w:hAnsi="Calibri"/>
+          <w:color w:val="2A1A20"/>
+          <w:sz w:val="21"/>
+          <w:szCs w:val="21"/>
+        </w:rPr>
+        <w:t xml:space="preserve"> : </w:t>
+      </w:r>
+      <w:r>
+        <w:rPr>
+          <w:rFonts w:ascii="Calibri" w:cs="Calibri" w:eastAsia="Calibri" w:hAnsi="Calibri"/>
+          <w:b/>
+          <w:bCs/>
+          <w:color w:val="2A1A20"/>
+          <w:sz w:val="21"/>
+          <w:szCs w:val="21"/>
+        </w:rPr>
+        <w:t xml:space="preserve">mini</w:t>
+      </w:r>
+      <w:r>
+        <w:rPr>
+          <w:rFonts w:ascii="Calibri" w:cs="Calibri" w:eastAsia="Calibri" w:hAnsi="Calibri"/>
+          <w:color w:val="2A1A20"/>
+          <w:sz w:val="21"/>
+          <w:szCs w:val="21"/>
+        </w:rPr>
+        <w:t xml:space="preserve"> (enfants de 4 à 11 ans), </w:t>
+      </w:r>
+      <w:r>
+        <w:rPr>
+          <w:rFonts w:ascii="Calibri" w:cs="Calibri" w:eastAsia="Calibri" w:hAnsi="Calibri"/>
+          <w:b/>
+          <w:bCs/>
+          <w:color w:val="2A1A20"/>
+          <w:sz w:val="21"/>
+          <w:szCs w:val="21"/>
+        </w:rPr>
+        <w:t xml:space="preserve">active</w:t>
+      </w:r>
+      <w:r>
+        <w:rPr>
+          <w:rFonts w:ascii="Calibri" w:cs="Calibri" w:eastAsia="Calibri" w:hAnsi="Calibri"/>
+          <w:color w:val="2A1A20"/>
+          <w:sz w:val="21"/>
+          <w:szCs w:val="21"/>
+        </w:rPr>
+        <w:t xml:space="preserve"> (femmes actives), </w:t>
+      </w:r>
+      <w:r>
+        <w:rPr>
+          <w:rFonts w:ascii="Calibri" w:cs="Calibri" w:eastAsia="Calibri" w:hAnsi="Calibri"/>
+          <w:b/>
+          <w:bCs/>
+          <w:color w:val="2A1A20"/>
+          <w:sz w:val="21"/>
+          <w:szCs w:val="21"/>
+        </w:rPr>
+        <w:t xml:space="preserve">luna</w:t>
+      </w:r>
+      <w:r>
+        <w:rPr>
+          <w:rFonts w:ascii="Calibri" w:cs="Calibri" w:eastAsia="Calibri" w:hAnsi="Calibri"/>
+          <w:color w:val="2A1A20"/>
+          <w:sz w:val="21"/>
+          <w:szCs w:val="21"/>
+        </w:rPr>
+        <w:t xml:space="preserve"> (santé féminine) et </w:t>
+      </w:r>
+      <w:r>
+        <w:rPr>
+          <w:rFonts w:ascii="Calibri" w:cs="Calibri" w:eastAsia="Calibri" w:hAnsi="Calibri"/>
+          <w:b/>
+          <w:bCs/>
+          <w:color w:val="2A1A20"/>
+          <w:sz w:val="21"/>
+          <w:szCs w:val="21"/>
+        </w:rPr>
+        <w:t xml:space="preserve">silver</w:t>
+      </w:r>
+      <w:r>
+        <w:rPr>
+          <w:rFonts w:ascii="Calibri" w:cs="Calibri" w:eastAsia="Calibri" w:hAnsi="Calibri"/>
+          <w:color w:val="2A1A20"/>
+          <w:sz w:val="21"/>
+          <w:szCs w:val="21"/>
+        </w:rPr>
+        <w:t xml:space="preserve"> (seniors). Le modèle repose sur la vente en ligne par abonnement et sur une fabrication sous-traitée à un partenaire technologique (Unistraw ou un autre fournisseur). Le lancement commencera par une gamme, luna, puis s'étendra aux trois autres.</w:t>
       </w:r>
     </w:p>
     <w:tbl>
@@ -649,7 +749,7 @@
                 <w:sz w:val="16"/>
                 <w:szCs w:val="16"/>
               </w:rPr>
-              <w:t xml:space="preserve">Unistraw apporte la technologie, une sage-femme la crédibilité, les créatrices la visibilité : sans eux, pas de produit.</w:t>
+              <w:t xml:space="preserve">Le fabricant apporte la technologie ; un comité santé (pédiatre, sage-femme, gériatre) la crédibilité sur chaque gamme ; créatrices et pharmacies la visibilité.</w:t>
             </w:r>
           </w:p>
         </w:tc>
@@ -789,7 +889,7 @@
                 <w:sz w:val="16"/>
                 <w:szCs w:val="16"/>
               </w:rPr>
-              <w:t xml:space="preserve">Le produit reste payant ; le contenu autour peut être gratuit (carte du cycle, rappels, conseils).</w:t>
+              <w:t xml:space="preserve">Le produit reste payant ; le contenu autour peut être gratuit : tableau de stickers mini, carte du cycle luna, conseils pour chaque âge.</w:t>
             </w:r>
           </w:p>
         </w:tc>
@@ -929,7 +1029,7 @@
                 <w:sz w:val="16"/>
                 <w:szCs w:val="16"/>
               </w:rPr>
-              <w:t xml:space="preserve">Premier canal pour toucher les femmes de 20 à 35 ans : contenus, créatrices, #mysiplabroutine.</w:t>
+              <w:t xml:space="preserve">Canal clé pour les parents, les femmes actives et les femmes de 20 à 35 ans, qui achètent aussi pour leurs parents âgés. #mysiplabroutine.</w:t>
             </w:r>
           </w:p>
         </w:tc>
@@ -1069,7 +1169,7 @@
                 <w:sz w:val="16"/>
                 <w:szCs w:val="16"/>
               </w:rPr>
-              <w:t xml:space="preserve">Déjà prévu dans le modèle : fabrication sous-traitée, vente en ligne, pas d'usine.</w:t>
+              <w:t xml:space="preserve">Déjà prévu : fabrication sous-traitée, vente en ligne, un même format de paille et d'étui pour les 4 gammes.</w:t>
             </w:r>
           </w:p>
         </w:tc>
@@ -1209,7 +1309,7 @@
                 <w:sz w:val="16"/>
                 <w:szCs w:val="16"/>
               </w:rPr>
-              <w:t xml:space="preserve">C'est la promesse : rien à avaler, une paille par jour, livrée au bon moment du cycle.</w:t>
+              <w:t xml:space="preserve">C'est la promesse : rien à avaler, de 4 à 104 ans, une paille par jour dans la boisson habituelle.</w:t>
             </w:r>
           </w:p>
         </w:tc>
@@ -1349,7 +1449,7 @@
                 <w:sz w:val="16"/>
                 <w:szCs w:val="16"/>
               </w:rPr>
-              <w:t xml:space="preserve">Une application de suivi du cycle avec rappels : intéressant, mais après le lancement.</w:t>
+              <w:t xml:space="preserve">Une application de rappels et de suivi pour toute la famille (enfants, cycle, parents âgés) : après le lancement.</w:t>
             </w:r>
           </w:p>
         </w:tc>
@@ -1489,7 +1589,7 @@
                 <w:sz w:val="16"/>
                 <w:szCs w:val="16"/>
               </w:rPr>
-              <w:t xml:space="preserve">Cœur du modèle : fabrication par le partenaire (CDMO), logistique, communication par les créatrices.</w:t>
+              <w:t xml:space="preserve">Cœur du modèle : 16 formules fabriquées par un partenaire (CDMO), logistique, communication par les créatrices, pharmacies pour silver.</w:t>
             </w:r>
           </w:p>
         </w:tc>
@@ -1629,7 +1729,7 @@
                 <w:sz w:val="16"/>
                 <w:szCs w:val="16"/>
               </w:rPr>
-              <w:t xml:space="preserve">Accès au marché français pour le fabricant, commission pour les créatrices : utile pour négocier.</w:t>
+              <w:t xml:space="preserve">Pour le fabricant, une marque en 4 gammes et un accès au marché français ; pour les créatrices et pharmacies, une commission ou une marge.</w:t>
             </w:r>
           </w:p>
         </w:tc>
@@ -1769,7 +1869,7 @@
                 <w:sz w:val="16"/>
                 <w:szCs w:val="16"/>
               </w:rPr>
-              <w:t xml:space="preserve">Simplicité, régularité, un moment à soi : c'est la proposition de valeur.</w:t>
+              <w:t xml:space="preserve">Pour chaque âge : un geste ludique (mini), une routine simple (active), un suivi du cycle (luna), une prise facilitée et une meilleure hydratation (silver).</w:t>
             </w:r>
           </w:p>
         </w:tc>
@@ -1909,7 +2009,7 @@
                 <w:sz w:val="16"/>
                 <w:szCs w:val="16"/>
               </w:rPr>
-              <w:t xml:space="preserve">L'abonnement calé sur le cycle transforme le produit en service récurrent.</w:t>
+              <w:t xml:space="preserve">L'abonnement par gamme, ou une box famille qui regroupe plusieurs gammes, livrée chaque mois.</w:t>
             </w:r>
           </w:p>
         </w:tc>
@@ -2049,7 +2149,7 @@
                 <w:sz w:val="16"/>
                 <w:szCs w:val="16"/>
               </w:rPr>
-              <w:t xml:space="preserve">Oublis, gélules difficiles à avaler, symptômes du cycle : à formuler clairement.</w:t>
+              <w:t xml:space="preserve">Les enfants refusent sirops et gélules, les seniors avalent difficilement, les femmes oublient leurs compléments.</w:t>
             </w:r>
           </w:p>
         </w:tc>
@@ -2189,7 +2289,7 @@
                 <w:sz w:val="16"/>
                 <w:szCs w:val="16"/>
               </w:rPr>
-              <w:t xml:space="preserve">Le rituel : paille datée, déballage, geste quotidien. C'est l'élément différenciant.</w:t>
+              <w:t xml:space="preserve">Un rituel adapté à chaque âge : stickers pour les enfants, journée en 4 moments, roue du cycle, compteur d'eau pour les seniors.</w:t>
             </w:r>
           </w:p>
         </w:tc>
@@ -2609,7 +2709,7 @@
                 <w:sz w:val="16"/>
                 <w:szCs w:val="16"/>
               </w:rPr>
-              <w:t xml:space="preserve">Box personnalisée, coffret cadeau, livraison express : revenus complémentaires plus tard.</w:t>
+              <w:t xml:space="preserve">Box famille, coffret découverte des 4 gammes, coffret cadeau : revenus complémentaires.</w:t>
             </w:r>
           </w:p>
         </w:tc>
@@ -2749,7 +2849,7 @@
                 <w:sz w:val="16"/>
                 <w:szCs w:val="16"/>
               </w:rPr>
-              <w:t xml:space="preserve">Les codes promo des créatrices sont de l'affiliation : c'est le levier d'acquisition.</w:t>
+              <w:t xml:space="preserve">Codes des créatrices pour chaque univers (parentalité, sport, santé féminine) : le levier d'acquisition.</w:t>
             </w:r>
           </w:p>
         </w:tc>
@@ -2889,7 +2989,7 @@
                 <w:sz w:val="16"/>
                 <w:szCs w:val="16"/>
               </w:rPr>
-              <w:t xml:space="preserve">Déjà dans le positionnement : les gélules sont partout, mais on les oublie et elles s'avalent mal.</w:t>
+              <w:t xml:space="preserve">Déjà dans le positionnement : les gélules sont partout, mais on les oublie et elles s'avalent mal, surtout chez les enfants et les seniors.</w:t>
             </w:r>
           </w:p>
         </w:tc>
@@ -3169,7 +3269,7 @@
                 <w:sz w:val="16"/>
                 <w:szCs w:val="16"/>
               </w:rPr>
-              <w:t xml:space="preserve">Précommandes et abonnement prépayé : indispensable face aux quantités minimum du fabricant.</w:t>
+              <w:t xml:space="preserve">Précommandes et abonnement prépayé : indispensable face aux quantités minimum, multipliées par 16 références.</w:t>
             </w:r>
           </w:p>
         </w:tc>
@@ -3253,7 +3353,7 @@
               <w:bottom w:val="single" w:color="E3D6DA" w:sz="4"/>
               <w:right w:val="single" w:color="E3D6DA" w:sz="4"/>
             </w:tcBorders>
-            <w:shd w:fill="FCE8D2" w:color="auto" w:val="clear"/>
+            <w:shd w:fill="DDF0E4" w:color="auto" w:val="clear"/>
             <w:tcMar>
               <w:top w:type="dxa" w:w="70"/>
               <w:left w:type="dxa" w:w="100"/>
@@ -3272,11 +3372,11 @@
                 <w:rFonts w:ascii="Calibri" w:cs="Calibri" w:eastAsia="Calibri" w:hAnsi="Calibri"/>
                 <w:b/>
                 <w:bCs/>
-                <w:color w:val="A85A0C"/>
-                <w:sz w:val="17"/>
-                <w:szCs w:val="17"/>
-              </w:rPr>
-              <w:t xml:space="preserve">Orange</w:t>
+                <w:color w:val="1E7A45"/>
+                <w:sz w:val="17"/>
+                <w:szCs w:val="17"/>
+              </w:rPr>
+              <w:t xml:space="preserve">Vert</w:t>
             </w:r>
           </w:p>
         </w:tc>
@@ -3309,7 +3409,7 @@
                 <w:sz w:val="16"/>
                 <w:szCs w:val="16"/>
               </w:rPr>
-              <w:t xml:space="preserve">De luna vers active, puis mini pour les mères : stratégie de croissance, à plus long terme.</w:t>
+              <w:t xml:space="preserve">Tout l'intérêt des 4 gammes : une cliente luna achète mini pour ses enfants, silver pour ses parents, active pour elle.</w:t>
             </w:r>
           </w:p>
         </w:tc>
@@ -3449,7 +3549,7 @@
                 <w:sz w:val="16"/>
                 <w:szCs w:val="16"/>
               </w:rPr>
-              <w:t xml:space="preserve">Une campagne (Ulule, KissKiss) sert à la fois de test du MVP, de financement et de précommandes.</w:t>
+              <w:t xml:space="preserve">Une campagne présentant les 4 gammes sert de test (quelle gamme attire le plus ?), de financement et de précommandes.</w:t>
             </w:r>
           </w:p>
         </w:tc>
@@ -3589,7 +3689,7 @@
                 <w:sz w:val="16"/>
                 <w:szCs w:val="16"/>
               </w:rPr>
-              <w:t xml:space="preserve">Faire voter la communauté sur les saveurs ou les formules : bon pour l'engagement.</w:t>
+              <w:t xml:space="preserve">Faire voter la communauté sur les saveurs ou la prochaine gamme à lancer : bon pour l'engagement.</w:t>
             </w:r>
           </w:p>
         </w:tc>
@@ -3729,7 +3829,7 @@
                 <w:sz w:val="16"/>
                 <w:szCs w:val="16"/>
               </w:rPr>
-              <w:t xml:space="preserve">La rentabilité repose sur le réachat à chaque cycle.</w:t>
+              <w:t xml:space="preserve">La rentabilité repose sur le réachat chaque mois, dans chaque gamme, et sur le passage d'une gamme à l'autre.</w:t>
             </w:r>
           </w:p>
         </w:tc>
@@ -4009,7 +4109,7 @@
                 <w:sz w:val="16"/>
                 <w:szCs w:val="16"/>
               </w:rPr>
-              <w:t xml:space="preserve">Vente en ligne directe au lancement : meilleure marge et lien direct avec les clientes.</w:t>
+              <w:t xml:space="preserve">Vente en ligne directe pour toutes les gammes au lancement ; la pharmacie viendra ensuite, surtout pour silver et mini.</w:t>
             </w:r>
           </w:p>
         </w:tc>
@@ -4289,7 +4389,7 @@
                 <w:sz w:val="16"/>
                 <w:szCs w:val="16"/>
               </w:rPr>
-              <w:t xml:space="preserve">Packaging, conseils et suivi comptent autant que le produit.</w:t>
+              <w:t xml:space="preserve">Une même marque, mais un univers par âge : packaging, conseils et suivi comptent autant que le produit.</w:t>
             </w:r>
           </w:p>
         </w:tc>
@@ -4653,7 +4753,7 @@
                 <w:sz w:val="20"/>
                 <w:szCs w:val="20"/>
               </w:rPr>
-              <w:t xml:space="preserve">14 questions vertes</w:t>
+              <w:t xml:space="preserve">15 questions vertes</w:t>
             </w:r>
             <w:r>
               <w:rPr>
@@ -4662,7 +4762,7 @@
                 <w:sz w:val="20"/>
                 <w:szCs w:val="20"/>
               </w:rPr>
-              <w:t xml:space="preserve">, 10 orange et 5 rouges. Les questions essentielles portent sur trois sujets : les partenaires (fabricant, créatrices), le financement du lancement (précommandes, crowdfunding) et la relation client dans la durée (rituel, abonnement, fidélisation).</w:t>
+              <w:t xml:space="preserve">, 9 orange et 5 rouges. Les questions essentielles portent sur trois sujets : les partenaires (fabricant, comité santé, créatrices), le financement d'une marque en 16 références (précommandes, crowdfunding) et la relation avec toute la famille (rituel, abonnement, ventes croisées entre les gammes).</w:t>
             </w:r>
           </w:p>
         </w:tc>
@@ -4675,7 +4775,7 @@
     </w:p>
     <w:p>
       <w:pPr>
-        <w:pageBreakBefore/>
+        <w:keepNext/>
         <w:spacing w:after="60"/>
       </w:pPr>
       <w:r>
@@ -4718,7 +4818,7 @@
           <w:sz w:val="21"/>
           <w:szCs w:val="21"/>
         </w:rPr>
-        <w:t xml:space="preserve">Parmi les questions vertes, trois sont particulièrement structurantes : elles répondent à la manière de </w:t>
+        <w:t xml:space="preserve">Parmi les questions vertes, trois sont particulièrement structurantes pour une marque en 4 gammes : elles répondent à la manière de </w:t>
       </w:r>
       <w:r>
         <w:rPr>
@@ -4769,7 +4869,7 @@
           <w:sz w:val="21"/>
           <w:szCs w:val="21"/>
         </w:rPr>
-        <w:t xml:space="preserve">devenir rentable</w:t>
+        <w:t xml:space="preserve">faire grandir la marque</w:t>
       </w:r>
       <w:r>
         <w:rPr>
@@ -4778,7 +4878,7 @@
           <w:sz w:val="21"/>
           <w:szCs w:val="21"/>
         </w:rPr>
-        <w:t xml:space="preserve">.</w:t>
+        <w:t xml:space="preserve"> avec toute la famille.</w:t>
       </w:r>
     </w:p>
     <w:p>
@@ -4838,7 +4938,7 @@
           <w:sz w:val="21"/>
           <w:szCs w:val="21"/>
         </w:rPr>
-        <w:t xml:space="preserve"> C'est la question la plus structurante : sip lab ne fabrique pas elle-même. Tout le projet dépend d'un partenaire technologique (Unistraw ou un autre fournisseur) qui détient les brevets et le savoir-faire industriel.</w:t>
+        <w:t xml:space="preserve"> C'est la question la plus structurante : sip lab ne fabrique pas elle-même. Les 4 gammes et leurs 16 formules dépendent d'un partenaire technologique (Unistraw ou un autre fournisseur), qui détient les brevets et le savoir-faire industriel.</w:t>
       </w:r>
     </w:p>
     <w:tbl>
@@ -4901,7 +5001,7 @@
                 <w:sz w:val="20"/>
                 <w:szCs w:val="20"/>
               </w:rPr>
-              <w:t xml:space="preserve">•  Répartir les rôles avec le fabricant : pré-formulation, études de stabilité, production, packaging.</w:t>
+              <w:t xml:space="preserve">•  Répartir les rôles avec le fabricant : pré-formulation, stabilité, production, packaging, pour chaque gamme.</w:t>
             </w:r>
           </w:p>
           <w:p>
@@ -4915,7 +5015,7 @@
                 <w:sz w:val="20"/>
                 <w:szCs w:val="20"/>
               </w:rPr>
-              <w:t xml:space="preserve">•  Mesurer la dépendance : exclusivité possible sur la France, solution de repli (autres fournisseurs, piste au Brésil).</w:t>
+              <w:t xml:space="preserve">•  Mutualiser : un même format de paille et d'étui pour les 4 gammes, seules les formules changent.</w:t>
             </w:r>
           </w:p>
           <w:p>
@@ -4929,7 +5029,21 @@
                 <w:sz w:val="20"/>
                 <w:szCs w:val="20"/>
               </w:rPr>
-              <w:t xml:space="preserve">•  Identifier les autres fonctions à déléguer : logistique, service client, communication via les créatrices.</w:t>
+              <w:t xml:space="preserve">•  Mesurer la dépendance : exclusivité possible sur la France, solution de repli (autres fournisseurs, piste au Brésil).</w:t>
+            </w:r>
+          </w:p>
+          <w:p>
+            <w:pPr>
+              <w:spacing w:after="70" w:line="280"/>
+            </w:pPr>
+            <w:r>
+              <w:rPr>
+                <w:rFonts w:ascii="Calibri" w:cs="Calibri" w:eastAsia="Calibri" w:hAnsi="Calibri"/>
+                <w:color w:val="2A1A20"/>
+                <w:sz w:val="20"/>
+                <w:szCs w:val="20"/>
+              </w:rPr>
+              <w:t xml:space="preserve">•  Déléguer le reste : logistique, communication via les créatrices, distribution en pharmacie pour silver.</w:t>
             </w:r>
           </w:p>
         </w:tc>
@@ -4997,7 +5111,7 @@
           <w:sz w:val="21"/>
           <w:szCs w:val="21"/>
         </w:rPr>
-        <w:t xml:space="preserve"> Les quantités minimum de commande du fabricant imposeront un stock important dès le départ. Encaisser avant de payer permet de lancer le projet avec peu de capitaux, tout en vérifiant que la demande existe.</w:t>
+        <w:t xml:space="preserve"> Avec 16 références, les quantités minimum de commande peuvent vite représenter un stock très lourd. Encaisser avant de payer permet de financer la production gamme par gamme, en vérifiant la demande avant chaque lancement.</w:t>
       </w:r>
     </w:p>
     <w:tbl>
@@ -5060,7 +5174,7 @@
                 <w:sz w:val="20"/>
                 <w:szCs w:val="20"/>
               </w:rPr>
-              <w:t xml:space="preserve">•  Précommandes et campagne de crowdfunding avant la première production (lien avec la question 22).</w:t>
+              <w:t xml:space="preserve">•  Précommandes et crowdfunding avant chaque première production (lien avec la question 22).</w:t>
             </w:r>
           </w:p>
           <w:p>
@@ -5074,7 +5188,7 @@
                 <w:sz w:val="20"/>
                 <w:szCs w:val="20"/>
               </w:rPr>
-              <w:t xml:space="preserve">•  Abonnement payé d'avance, par cycle ou par trimestre.</w:t>
+              <w:t xml:space="preserve">•  Lancer les gammes une par une (luna, puis active, mini, silver) pour étaler les besoins de stock.</w:t>
             </w:r>
           </w:p>
           <w:p>
@@ -5088,7 +5202,7 @@
                 <w:sz w:val="20"/>
                 <w:szCs w:val="20"/>
               </w:rPr>
-              <w:t xml:space="preserve">•  Délais de paiement à négocier avec le fournisseur.</w:t>
+              <w:t xml:space="preserve">•  Abonnement payé d'avance et délais de paiement à négocier avec le fournisseur.</w:t>
             </w:r>
           </w:p>
         </w:tc>
@@ -5114,7 +5228,7 @@
           <w:sz w:val="18"/>
           <w:szCs w:val="18"/>
         </w:rPr>
-        <w:t xml:space="preserve">3. Question 24</w:t>
+        <w:t xml:space="preserve">3. Question 21</w:t>
       </w:r>
     </w:p>
     <w:p>
@@ -5129,7 +5243,7 @@
           <w:sz w:val="26"/>
           <w:szCs w:val="26"/>
         </w:rPr>
-        <w:t xml:space="preserve">Fidélisation</w:t>
+        <w:t xml:space="preserve">Ventes croisées</w:t>
       </w:r>
     </w:p>
     <w:p>
@@ -5156,7 +5270,7 @@
           <w:sz w:val="21"/>
           <w:szCs w:val="21"/>
         </w:rPr>
-        <w:t xml:space="preserve"> Une paille représente un petit panier : la rentabilité vient des clientes qui reviennent à chaque cycle. C'est là que le rituel prend tout son sens (lien avec la question 12).</w:t>
+        <w:t xml:space="preserve"> C'est ce qui donne tout son sens à une marque en 4 gammes : une même cliente peut acheter pour elle, pour ses enfants et pour ses parents. Chaque nouvelle gamme se vend d'abord aux clientes existantes, ce qui réduit le coût d'acquisition (lien avec la fidélisation, question 24).</w:t>
       </w:r>
     </w:p>
     <w:tbl>
@@ -5219,7 +5333,7 @@
                 <w:sz w:val="20"/>
                 <w:szCs w:val="20"/>
               </w:rPr>
-              <w:t xml:space="preserve">•  Faire du rituel une habitude : rappels, carte du cycle, communauté.</w:t>
+              <w:t xml:space="preserve">•  Proposer une box famille et un coffret découverte des 4 gammes.</w:t>
             </w:r>
           </w:p>
           <w:p>
@@ -5233,7 +5347,7 @@
                 <w:sz w:val="20"/>
                 <w:szCs w:val="20"/>
               </w:rPr>
-              <w:t xml:space="preserve">•  Fixer un objectif de réachat : au moins 40 % au deuxième cycle (hypothèse H3).</w:t>
+              <w:t xml:space="preserve">•  Recommander la gamme suivante au bon moment : mini aux clientes mères, silver à celles qui ont des parents âgés.</w:t>
             </w:r>
           </w:p>
           <w:p>
@@ -5247,7 +5361,7 @@
                 <w:sz w:val="20"/>
                 <w:szCs w:val="20"/>
               </w:rPr>
-              <w:t xml:space="preserve">•  Limiter les désabonnements : pause en un clic, attention au 3e cycle, parrainage.</w:t>
+              <w:t xml:space="preserve">•  Suivre le nombre de gammes achetées par cliente et le réachat dans chaque gamme.</w:t>
             </w:r>
           </w:p>
         </w:tc>
@@ -5338,7 +5452,7 @@
                 <w:sz w:val="20"/>
                 <w:szCs w:val="20"/>
               </w:rPr>
-              <w:t xml:space="preserve"> (7), </w:t>
+              <w:t xml:space="preserve"> les 4 gammes (7), </w:t>
             </w:r>
             <w:r>
               <w:rPr>
@@ -5349,7 +5463,7 @@
                 <w:sz w:val="20"/>
                 <w:szCs w:val="20"/>
               </w:rPr>
-              <w:t xml:space="preserve">comment je finance le lancement</w:t>
+              <w:t xml:space="preserve">comment je finance</w:t>
             </w:r>
             <w:r>
               <w:rPr>
@@ -5358,7 +5472,7 @@
                 <w:sz w:val="20"/>
                 <w:szCs w:val="20"/>
               </w:rPr>
-              <w:t xml:space="preserve"> (20) et </w:t>
+              <w:t xml:space="preserve"> leur lancement progressif (20) et </w:t>
             </w:r>
             <w:r>
               <w:rPr>
@@ -5369,7 +5483,7 @@
                 <w:sz w:val="20"/>
                 <w:szCs w:val="20"/>
               </w:rPr>
-              <w:t xml:space="preserve">comment je deviens rentable</w:t>
+              <w:t xml:space="preserve">comment je fais grandir la marque</w:t>
             </w:r>
             <w:r>
               <w:rPr>
@@ -5378,7 +5492,7 @@
                 <w:sz w:val="20"/>
                 <w:szCs w:val="20"/>
               </w:rPr>
-              <w:t xml:space="preserve"> (24).</w:t>
+              <w:t xml:space="preserve"> avec toute la famille (21).</w:t>
             </w:r>
           </w:p>
         </w:tc>

</xml_diff>

<commit_message>
Questions business model : BFR négatif en orange, rituel (Q12) dans le top 3
Co-Authored-By: Claude Opus 5.5 <noreply@anthropic.com>
Claude-Session: https://claude.ai/code/session_01GhVoXRgaJJbfXgbund27Nd
</commit_message>
<xml_diff>
--- a/livrables/Questions_Business_Model_sip_lab.docx
+++ b/livrables/Questions_Business_Model_sip_lab.docx
@@ -3213,7 +3213,7 @@
               <w:bottom w:val="single" w:color="E3D6DA" w:sz="4"/>
               <w:right w:val="single" w:color="E3D6DA" w:sz="4"/>
             </w:tcBorders>
-            <w:shd w:fill="DDF0E4" w:color="auto" w:val="clear"/>
+            <w:shd w:fill="FCE8D2" w:color="auto" w:val="clear"/>
             <w:tcMar>
               <w:top w:type="dxa" w:w="70"/>
               <w:left w:type="dxa" w:w="100"/>
@@ -3232,11 +3232,11 @@
                 <w:rFonts w:ascii="Calibri" w:cs="Calibri" w:eastAsia="Calibri" w:hAnsi="Calibri"/>
                 <w:b/>
                 <w:bCs/>
-                <w:color w:val="1E7A45"/>
-                <w:sz w:val="17"/>
-                <w:szCs w:val="17"/>
-              </w:rPr>
-              <w:t xml:space="preserve">Vert</w:t>
+                <w:color w:val="A85A0C"/>
+                <w:sz w:val="17"/>
+                <w:szCs w:val="17"/>
+              </w:rPr>
+              <w:t xml:space="preserve">Orange</w:t>
             </w:r>
           </w:p>
         </w:tc>
@@ -3269,7 +3269,7 @@
                 <w:sz w:val="16"/>
                 <w:szCs w:val="16"/>
               </w:rPr>
-              <w:t xml:space="preserve">Précommandes et abonnement prépayé : indispensable face aux quantités minimum, multipliées par 16 références.</w:t>
+              <w:t xml:space="preserve">Possible seulement en partie : au lancement (précommandes, crowdfunding) ou pour les cures en abonnement prépayé. Ensuite, comme tout commerce de produits, il faut un stock avant de vendre : le BFR sera positif et devra être financé.</w:t>
             </w:r>
           </w:p>
         </w:tc>
@@ -4753,7 +4753,7 @@
                 <w:sz w:val="20"/>
                 <w:szCs w:val="20"/>
               </w:rPr>
-              <w:t xml:space="preserve">15 questions vertes</w:t>
+              <w:t xml:space="preserve">14 questions vertes</w:t>
             </w:r>
             <w:r>
               <w:rPr>
@@ -4762,7 +4762,7 @@
                 <w:sz w:val="20"/>
                 <w:szCs w:val="20"/>
               </w:rPr>
-              <w:t xml:space="preserve">, 9 orange et 5 rouges. Les questions essentielles portent sur trois sujets : les partenaires (fabricant, comité santé, créatrices), le financement d'une marque en 16 références (précommandes, crowdfunding) et la relation avec toute la famille (rituel, abonnement, ventes croisées entre les gammes).</w:t>
+              <w:t xml:space="preserve">, 10 orange et 5 rouges. Les questions essentielles portent sur trois sujets : les partenaires (fabricant, comité santé, créatrices), le financement du lancement (crowdfunding) et la relation avec toute la famille (rituel, abonnement, ventes croisées entre les gammes).</w:t>
             </w:r>
           </w:p>
         </w:tc>
@@ -4849,7 +4849,7 @@
           <w:sz w:val="21"/>
           <w:szCs w:val="21"/>
         </w:rPr>
-        <w:t xml:space="preserve">financer le lancement</w:t>
+        <w:t xml:space="preserve">se différencier</w:t>
       </w:r>
       <w:r>
         <w:rPr>
@@ -5069,7 +5069,7 @@
           <w:sz w:val="18"/>
           <w:szCs w:val="18"/>
         </w:rPr>
-        <w:t xml:space="preserve">2. Question 20</w:t>
+        <w:t xml:space="preserve">2. Question 12</w:t>
       </w:r>
     </w:p>
     <w:p>
@@ -5084,7 +5084,7 @@
           <w:sz w:val="26"/>
           <w:szCs w:val="26"/>
         </w:rPr>
-        <w:t xml:space="preserve">BFR négatif : encaisser avant de payer</w:t>
+        <w:t xml:space="preserve">Quelle expérience client mémorable pouvez-vous faire vivre aux utilisateurs ?</w:t>
       </w:r>
     </w:p>
     <w:p>
@@ -5111,7 +5111,7 @@
           <w:sz w:val="21"/>
           <w:szCs w:val="21"/>
         </w:rPr>
-        <w:t xml:space="preserve"> Avec 16 références, les quantités minimum de commande peuvent vite représenter un stock très lourd. Encaisser avant de payer permet de financer la production gamme par gamme, en vérifiant la demande avant chaque lancement.</w:t>
+        <w:t xml:space="preserve"> C'est le cœur du concept : des gélules et des gummies existent déjà, la différence de sip lab tient au rituel. Un geste simple et agréable, que l'on a envie de refaire, adapté à chaque âge. C'est aussi ce qui fait revenir les clientes (lien avec la fidélisation, question 24).</w:t>
       </w:r>
     </w:p>
     <w:tbl>
@@ -5174,7 +5174,7 @@
                 <w:sz w:val="20"/>
                 <w:szCs w:val="20"/>
               </w:rPr>
-              <w:t xml:space="preserve">•  Précommandes et crowdfunding avant chaque première production (lien avec la question 22).</w:t>
+              <w:t xml:space="preserve">•  Décliner le rituel par gamme : stickers pour mini, journée en 4 moments pour active, roue du cycle pour luna, compteur d'eau pour silver.</w:t>
             </w:r>
           </w:p>
           <w:p>
@@ -5188,7 +5188,7 @@
                 <w:sz w:val="20"/>
                 <w:szCs w:val="20"/>
               </w:rPr>
-              <w:t xml:space="preserve">•  Lancer les gammes une par une (luna, puis active, mini, silver) pour étaler les besoins de stock.</w:t>
+              <w:t xml:space="preserve">•  Soigner les moments clés : déballage, paille datée, premier jour, rappel, réabonnement.</w:t>
             </w:r>
           </w:p>
           <w:p>
@@ -5202,7 +5202,7 @@
                 <w:sz w:val="20"/>
                 <w:szCs w:val="20"/>
               </w:rPr>
-              <w:t xml:space="preserve">•  Abonnement payé d'avance et délais de paiement à négocier avec le fournisseur.</w:t>
+              <w:t xml:space="preserve">•  Tester l'expérience avec de vraies clientes : est-ce que le rituel donne envie de continuer ?</w:t>
             </w:r>
           </w:p>
         </w:tc>
@@ -5463,7 +5463,7 @@
                 <w:sz w:val="20"/>
                 <w:szCs w:val="20"/>
               </w:rPr>
-              <w:t xml:space="preserve">comment je finance</w:t>
+              <w:t xml:space="preserve">comment je me différencie</w:t>
             </w:r>
             <w:r>
               <w:rPr>
@@ -5472,7 +5472,7 @@
                 <w:sz w:val="20"/>
                 <w:szCs w:val="20"/>
               </w:rPr>
-              <w:t xml:space="preserve"> leur lancement progressif (20) et </w:t>
+              <w:t xml:space="preserve"> grâce au rituel (12) et </w:t>
             </w:r>
             <w:r>
               <w:rPr>

</xml_diff>

<commit_message>
Questions business model : BFR en modèle mixte (production après encaissement + stock pour pharmacies et site)
Co-Authored-By: Claude Opus 5.5 <noreply@anthropic.com>
Claude-Session: https://claude.ai/code/session_01GhVoXRgaJJbfXgbund27Nd
</commit_message>
<xml_diff>
--- a/livrables/Questions_Business_Model_sip_lab.docx
+++ b/livrables/Questions_Business_Model_sip_lab.docx
@@ -3213,7 +3213,7 @@
               <w:bottom w:val="single" w:color="E3D6DA" w:sz="4"/>
               <w:right w:val="single" w:color="E3D6DA" w:sz="4"/>
             </w:tcBorders>
-            <w:shd w:fill="FCE8D2" w:color="auto" w:val="clear"/>
+            <w:shd w:fill="DDF0E4" w:color="auto" w:val="clear"/>
             <w:tcMar>
               <w:top w:type="dxa" w:w="70"/>
               <w:left w:type="dxa" w:w="100"/>
@@ -3232,11 +3232,11 @@
                 <w:rFonts w:ascii="Calibri" w:cs="Calibri" w:eastAsia="Calibri" w:hAnsi="Calibri"/>
                 <w:b/>
                 <w:bCs/>
-                <w:color w:val="A85A0C"/>
-                <w:sz w:val="17"/>
-                <w:szCs w:val="17"/>
-              </w:rPr>
-              <w:t xml:space="preserve">Orange</w:t>
+                <w:color w:val="1E7A45"/>
+                <w:sz w:val="17"/>
+                <w:szCs w:val="17"/>
+              </w:rPr>
+              <w:t xml:space="preserve">Vert</w:t>
             </w:r>
           </w:p>
         </w:tc>
@@ -3269,7 +3269,7 @@
                 <w:sz w:val="16"/>
                 <w:szCs w:val="16"/>
               </w:rPr>
-              <w:t xml:space="preserve">Possible seulement en partie : au lancement (précommandes, crowdfunding) ou pour les cures en abonnement prépayé. Ensuite, comme tout commerce de produits, il faut un stock avant de vendre : le BFR sera positif et devra être financé.</w:t>
+              <w:t xml:space="preserve">Modèle mixte : produire après encaissement pour les précommandes et les cures en abonnement, et garder un stock pour les pharmacies et les ventes classiques sur le site.</w:t>
             </w:r>
           </w:p>
         </w:tc>
@@ -4707,6 +4707,9 @@
         <w:gridCol w:w="9638"/>
       </w:tblGrid>
       <w:tr>
+        <w:trPr>
+          <w:cantSplit/>
+        </w:trPr>
         <w:tc>
           <w:tcPr>
             <w:tcW w:type="dxa" w:w="9638"/>
@@ -4753,7 +4756,7 @@
                 <w:sz w:val="20"/>
                 <w:szCs w:val="20"/>
               </w:rPr>
-              <w:t xml:space="preserve">14 questions vertes</w:t>
+              <w:t xml:space="preserve">15 questions vertes</w:t>
             </w:r>
             <w:r>
               <w:rPr>
@@ -4762,7 +4765,7 @@
                 <w:sz w:val="20"/>
                 <w:szCs w:val="20"/>
               </w:rPr>
-              <w:t xml:space="preserve">, 10 orange et 5 rouges. Les questions essentielles portent sur trois sujets : les partenaires (fabricant, comité santé, créatrices), le financement du lancement (crowdfunding) et la relation avec toute la famille (rituel, abonnement, ventes croisées entre les gammes).</w:t>
+              <w:t xml:space="preserve">, 9 orange et 5 rouges. Les questions essentielles portent sur trois sujets : les partenaires (fabricant, comité santé, créatrices), le financement du stock et du lancement (précommandes, abonnements, crowdfunding) et la relation avec toute la famille (rituel, abonnement, ventes croisées entre les gammes).</w:t>
             </w:r>
           </w:p>
         </w:tc>
@@ -4849,7 +4852,7 @@
           <w:sz w:val="21"/>
           <w:szCs w:val="21"/>
         </w:rPr>
-        <w:t xml:space="preserve">se différencier</w:t>
+        <w:t xml:space="preserve">financer le stock et le lancement</w:t>
       </w:r>
       <w:r>
         <w:rPr>
@@ -4957,6 +4960,9 @@
         <w:gridCol w:w="9638"/>
       </w:tblGrid>
       <w:tr>
+        <w:trPr>
+          <w:cantSplit/>
+        </w:trPr>
         <w:tc>
           <w:tcPr>
             <w:tcW w:type="dxa" w:w="9638"/>
@@ -5069,7 +5075,7 @@
           <w:sz w:val="18"/>
           <w:szCs w:val="18"/>
         </w:rPr>
-        <w:t xml:space="preserve">2. Question 12</w:t>
+        <w:t xml:space="preserve">2. Question 20</w:t>
       </w:r>
     </w:p>
     <w:p>
@@ -5084,7 +5090,7 @@
           <w:sz w:val="26"/>
           <w:szCs w:val="26"/>
         </w:rPr>
-        <w:t xml:space="preserve">Quelle expérience client mémorable pouvez-vous faire vivre aux utilisateurs ?</w:t>
+        <w:t xml:space="preserve">BFR négatif : encaisser avant de payer</w:t>
       </w:r>
     </w:p>
     <w:p>
@@ -5111,7 +5117,7 @@
           <w:sz w:val="21"/>
           <w:szCs w:val="21"/>
         </w:rPr>
-        <w:t xml:space="preserve"> C'est le cœur du concept : des gélules et des gummies existent déjà, la différence de sip lab tient au rituel. Un geste simple et agréable, que l'on a envie de refaire, adapté à chaque âge. C'est aussi ce qui fait revenir les clientes (lien avec la fidélisation, question 24).</w:t>
+        <w:t xml:space="preserve"> Comme tout commerce de produits, sip lab devra avoir du stock avant de vendre. Mais une partie des ventes peut être encaissée avant d'être produite. L'idée est de jouer sur les deux modèles pour limiter l'argent immobilisé dans le stock.</w:t>
       </w:r>
     </w:p>
     <w:tbl>
@@ -5130,6 +5136,9 @@
         <w:gridCol w:w="9638"/>
       </w:tblGrid>
       <w:tr>
+        <w:trPr>
+          <w:cantSplit/>
+        </w:trPr>
         <w:tc>
           <w:tcPr>
             <w:tcW w:type="dxa" w:w="9638"/>
@@ -5174,7 +5183,7 @@
                 <w:sz w:val="20"/>
                 <w:szCs w:val="20"/>
               </w:rPr>
-              <w:t xml:space="preserve">•  Décliner le rituel par gamme : stickers pour mini, journée en 4 moments pour active, roue du cycle pour luna, compteur d'eau pour silver.</w:t>
+              <w:t xml:space="preserve">•  Produire après encaissement : précommandes, crowdfunding et cures en abonnement payées d'avance. La production suit les commandes réelles.</w:t>
             </w:r>
           </w:p>
           <w:p>
@@ -5188,7 +5197,7 @@
                 <w:sz w:val="20"/>
                 <w:szCs w:val="20"/>
               </w:rPr>
-              <w:t xml:space="preserve">•  Soigner les moments clés : déballage, paille datée, premier jour, rappel, réabonnement.</w:t>
+              <w:t xml:space="preserve">•  Garder un stock pour le reste : les pharmacies et distributeurs, et les ventes classiques sur le site, ouvertes à tous.</w:t>
             </w:r>
           </w:p>
           <w:p>
@@ -5202,7 +5211,21 @@
                 <w:sz w:val="20"/>
                 <w:szCs w:val="20"/>
               </w:rPr>
-              <w:t xml:space="preserve">•  Tester l'expérience avec de vraies clientes : est-ce que le rituel donne envie de continuer ?</w:t>
+              <w:t xml:space="preserve">•  Équilibrer les deux : plus la part d'abonnements et de précommandes est grande, plus le stock à financer est faible. Négocier aussi des délais de paiement avec le fournisseur.</w:t>
+            </w:r>
+          </w:p>
+          <w:p>
+            <w:pPr>
+              <w:spacing w:after="70" w:line="280"/>
+            </w:pPr>
+            <w:r>
+              <w:rPr>
+                <w:rFonts w:ascii="Calibri" w:cs="Calibri" w:eastAsia="Calibri" w:hAnsi="Calibri"/>
+                <w:color w:val="2A1A20"/>
+                <w:sz w:val="20"/>
+                <w:szCs w:val="20"/>
+              </w:rPr>
+              <w:t xml:space="preserve">•  Lancer les gammes une par une (luna, puis active, mini, silver) pour étaler les besoins de stock.</w:t>
             </w:r>
           </w:p>
         </w:tc>
@@ -5289,6 +5312,9 @@
         <w:gridCol w:w="9638"/>
       </w:tblGrid>
       <w:tr>
+        <w:trPr>
+          <w:cantSplit/>
+        </w:trPr>
         <w:tc>
           <w:tcPr>
             <w:tcW w:type="dxa" w:w="9638"/>
@@ -5388,6 +5414,9 @@
         <w:gridCol w:w="9638"/>
       </w:tblGrid>
       <w:tr>
+        <w:trPr>
+          <w:cantSplit/>
+        </w:trPr>
         <w:tc>
           <w:tcPr>
             <w:tcW w:type="dxa" w:w="9638"/>
@@ -5463,7 +5492,7 @@
                 <w:sz w:val="20"/>
                 <w:szCs w:val="20"/>
               </w:rPr>
-              <w:t xml:space="preserve">comment je me différencie</w:t>
+              <w:t xml:space="preserve">comment je finance</w:t>
             </w:r>
             <w:r>
               <w:rPr>
@@ -5472,7 +5501,7 @@
                 <w:sz w:val="20"/>
                 <w:szCs w:val="20"/>
               </w:rPr>
-              <w:t xml:space="preserve"> grâce au rituel (12) et </w:t>
+              <w:t xml:space="preserve"> mon stock et mon lancement (20) et </w:t>
             </w:r>
             <w:r>
               <w:rPr>

</xml_diff>